<commit_message>
Rapor Times New Roman 12pt ve baslik punto ayari
Co-authored-by: ridvancaglarmutlu <ridvancaglarmutlu@users.noreply.github.com>
</commit_message>
<xml_diff>
--- a/kafe-rezervasyon/Kahve-Duragi-Proje-Raporu.docx
+++ b/kafe-rezervasyon/Kahve-Duragi-Proje-Raporu.docx
@@ -4,42 +4,42 @@
   <w:body>
     <w:p>
       <w:pPr>
-        <w:spacing w:after="80" w:before="0" w:line="240" w:lineRule="auto"/>
+        <w:spacing w:after="120" w:before="0" w:line="276" w:lineRule="auto"/>
         <w:jc w:val="center"/>
       </w:pPr>
       <w:r>
         <w:rPr>
-          <w:rFonts w:ascii="Times New Roman" w:hAnsi="Times New Roman" w:eastAsia="Times New Roman"/>
+          <w:rFonts w:ascii="Times New Roman" w:hAnsi="Times New Roman" w:eastAsia="Times New Roman" w:cs="Times New Roman"/>
           <w:b w:val="0"/>
           <w:i/>
-          <w:sz w:val="22"/>
+          <w:sz w:val="24"/>
         </w:rPr>
         <w:t>Veritabanı Dersi — Proje Raporu</w:t>
       </w:r>
     </w:p>
     <w:p>
       <w:pPr>
-        <w:spacing w:after="80" w:before="0" w:line="240" w:lineRule="auto"/>
+        <w:spacing w:after="200" w:before="160" w:line="276" w:lineRule="auto"/>
         <w:jc w:val="center"/>
       </w:pPr>
       <w:r>
         <w:rPr>
-          <w:rFonts w:ascii="Times New Roman" w:hAnsi="Times New Roman" w:eastAsia="Times New Roman"/>
+          <w:rFonts w:ascii="Times New Roman" w:hAnsi="Times New Roman" w:eastAsia="Times New Roman" w:cs="Times New Roman"/>
           <w:b/>
           <w:i w:val="0"/>
-          <w:sz w:val="36"/>
+          <w:sz w:val="44"/>
         </w:rPr>
         <w:t>Kahve Durağı Masa Rezervasyon Sistemi</w:t>
       </w:r>
     </w:p>
     <w:p>
       <w:pPr>
-        <w:spacing w:after="40" w:before="0" w:line="240" w:lineRule="auto"/>
+        <w:spacing w:after="80" w:before="80" w:line="276" w:lineRule="auto"/>
         <w:jc w:val="center"/>
       </w:pPr>
       <w:r>
         <w:rPr>
-          <w:rFonts w:ascii="Times New Roman" w:hAnsi="Times New Roman" w:eastAsia="Times New Roman"/>
+          <w:rFonts w:ascii="Times New Roman" w:hAnsi="Times New Roman" w:eastAsia="Times New Roman" w:cs="Times New Roman"/>
           <w:b w:val="0"/>
           <w:i w:val="0"/>
           <w:sz w:val="24"/>
@@ -49,15 +49,15 @@
     </w:p>
     <w:p>
       <w:pPr>
-        <w:spacing w:after="360" w:before="0" w:line="240" w:lineRule="auto"/>
+        <w:spacing w:after="360" w:before="0" w:line="276" w:lineRule="auto"/>
         <w:jc w:val="center"/>
       </w:pPr>
       <w:r>
         <w:rPr>
-          <w:rFonts w:ascii="Times New Roman" w:hAnsi="Times New Roman" w:eastAsia="Times New Roman"/>
+          <w:rFonts w:ascii="Times New Roman" w:hAnsi="Times New Roman" w:eastAsia="Times New Roman" w:cs="Times New Roman"/>
           <w:b w:val="0"/>
           <w:i/>
-          <w:sz w:val="22"/>
+          <w:sz w:val="24"/>
         </w:rPr>
         <w:t>Kafe: Kahve Durağı   ·   Çalışma saatleri: 09:00–23:00</w:t>
       </w:r>
@@ -66,10 +66,11 @@
       <w:pPr>
         <w:spacing w:after="160" w:before="0" w:line="276" w:lineRule="auto"/>
         <w:ind w:firstLine="425"/>
+        <w:jc w:val="both"/>
       </w:pPr>
       <w:r>
         <w:rPr>
-          <w:rFonts w:ascii="Times New Roman" w:hAnsi="Times New Roman" w:eastAsia="Times New Roman"/>
+          <w:rFonts w:ascii="Times New Roman" w:hAnsi="Times New Roman" w:eastAsia="Times New Roman" w:cs="Times New Roman"/>
           <w:b w:val="0"/>
           <w:i w:val="0"/>
           <w:sz w:val="24"/>
@@ -81,10 +82,11 @@
       <w:pPr>
         <w:spacing w:after="160" w:before="0" w:line="276" w:lineRule="auto"/>
         <w:ind w:firstLine="425"/>
+        <w:jc w:val="both"/>
       </w:pPr>
       <w:r>
         <w:rPr>
-          <w:rFonts w:ascii="Times New Roman" w:hAnsi="Times New Roman" w:eastAsia="Times New Roman"/>
+          <w:rFonts w:ascii="Times New Roman" w:hAnsi="Times New Roman" w:eastAsia="Times New Roman" w:cs="Times New Roman"/>
           <w:b w:val="0"/>
           <w:i w:val="0"/>
           <w:sz w:val="24"/>
@@ -94,12 +96,13 @@
     </w:p>
     <w:p>
       <w:pPr>
-        <w:spacing w:after="240" w:before="0" w:line="276" w:lineRule="auto"/>
+        <w:spacing w:after="160" w:before="0" w:line="276" w:lineRule="auto"/>
         <w:ind w:firstLine="425"/>
+        <w:jc w:val="both"/>
       </w:pPr>
       <w:r>
         <w:rPr>
-          <w:rFonts w:ascii="Times New Roman" w:hAnsi="Times New Roman" w:eastAsia="Times New Roman"/>
+          <w:rFonts w:ascii="Times New Roman" w:hAnsi="Times New Roman" w:eastAsia="Times New Roman" w:cs="Times New Roman"/>
           <w:b w:val="0"/>
           <w:i w:val="0"/>
           <w:sz w:val="24"/>
@@ -109,14 +112,16 @@
     </w:p>
     <w:p>
       <w:pPr>
-        <w:spacing w:after="120" w:before="320" w:line="264" w:lineRule="auto"/>
+        <w:keepNext/>
+        <w:spacing w:after="160" w:before="360" w:line="276" w:lineRule="auto"/>
+        <w:jc w:val="left"/>
       </w:pPr>
       <w:r>
         <w:rPr>
-          <w:rFonts w:ascii="Times New Roman" w:hAnsi="Times New Roman" w:eastAsia="Times New Roman"/>
+          <w:rFonts w:ascii="Times New Roman" w:hAnsi="Times New Roman" w:eastAsia="Times New Roman" w:cs="Times New Roman"/>
           <w:b/>
           <w:i w:val="0"/>
-          <w:sz w:val="28"/>
+          <w:sz w:val="32"/>
         </w:rPr>
         <w:t>Ne yaptım, kısaca</w:t>
       </w:r>
@@ -125,10 +130,11 @@
       <w:pPr>
         <w:spacing w:after="160" w:before="0" w:line="276" w:lineRule="auto"/>
         <w:ind w:firstLine="425"/>
+        <w:jc w:val="both"/>
       </w:pPr>
       <w:r>
         <w:rPr>
-          <w:rFonts w:ascii="Times New Roman" w:hAnsi="Times New Roman" w:eastAsia="Times New Roman"/>
+          <w:rFonts w:ascii="Times New Roman" w:hAnsi="Times New Roman" w:eastAsia="Times New Roman" w:cs="Times New Roman"/>
           <w:b w:val="0"/>
           <w:i w:val="0"/>
           <w:sz w:val="24"/>
@@ -137,7 +143,7 @@
       </w:r>
       <w:r>
         <w:rPr>
-          <w:rFonts w:ascii="Times New Roman" w:hAnsi="Times New Roman" w:eastAsia="Times New Roman"/>
+          <w:rFonts w:ascii="Times New Roman" w:hAnsi="Times New Roman" w:eastAsia="Times New Roman" w:cs="Times New Roman"/>
           <w:b w:val="0"/>
           <w:i/>
           <w:sz w:val="24"/>
@@ -146,7 +152,7 @@
       </w:r>
       <w:r>
         <w:rPr>
-          <w:rFonts w:ascii="Times New Roman" w:hAnsi="Times New Roman" w:eastAsia="Times New Roman"/>
+          <w:rFonts w:ascii="Times New Roman" w:hAnsi="Times New Roman" w:eastAsia="Times New Roman" w:cs="Times New Roman"/>
           <w:b w:val="0"/>
           <w:i w:val="0"/>
           <w:sz w:val="24"/>
@@ -155,7 +161,7 @@
       </w:r>
       <w:r>
         <w:rPr>
-          <w:rFonts w:ascii="Times New Roman" w:hAnsi="Times New Roman" w:eastAsia="Times New Roman"/>
+          <w:rFonts w:ascii="Times New Roman" w:hAnsi="Times New Roman" w:eastAsia="Times New Roman" w:cs="Times New Roman"/>
           <w:b w:val="0"/>
           <w:i/>
           <w:sz w:val="24"/>
@@ -164,7 +170,7 @@
       </w:r>
       <w:r>
         <w:rPr>
-          <w:rFonts w:ascii="Times New Roman" w:hAnsi="Times New Roman" w:eastAsia="Times New Roman"/>
+          <w:rFonts w:ascii="Times New Roman" w:hAnsi="Times New Roman" w:eastAsia="Times New Roman" w:cs="Times New Roman"/>
           <w:b w:val="0"/>
           <w:i w:val="0"/>
           <w:sz w:val="24"/>
@@ -176,10 +182,11 @@
       <w:pPr>
         <w:spacing w:after="160" w:before="0" w:line="276" w:lineRule="auto"/>
         <w:ind w:firstLine="425"/>
+        <w:jc w:val="both"/>
       </w:pPr>
       <w:r>
         <w:rPr>
-          <w:rFonts w:ascii="Times New Roman" w:hAnsi="Times New Roman" w:eastAsia="Times New Roman"/>
+          <w:rFonts w:ascii="Times New Roman" w:hAnsi="Times New Roman" w:eastAsia="Times New Roman" w:cs="Times New Roman"/>
           <w:b w:val="0"/>
           <w:i w:val="0"/>
           <w:sz w:val="24"/>
@@ -188,7 +195,7 @@
       </w:r>
       <w:r>
         <w:rPr>
-          <w:rFonts w:ascii="Times New Roman" w:hAnsi="Times New Roman" w:eastAsia="Times New Roman"/>
+          <w:rFonts w:ascii="Times New Roman" w:hAnsi="Times New Roman" w:eastAsia="Times New Roman" w:cs="Times New Roman"/>
           <w:b/>
           <w:i w:val="0"/>
           <w:sz w:val="24"/>
@@ -197,7 +204,7 @@
       </w:r>
       <w:r>
         <w:rPr>
-          <w:rFonts w:ascii="Times New Roman" w:hAnsi="Times New Roman" w:eastAsia="Times New Roman"/>
+          <w:rFonts w:ascii="Times New Roman" w:hAnsi="Times New Roman" w:eastAsia="Times New Roman" w:cs="Times New Roman"/>
           <w:b w:val="0"/>
           <w:i w:val="0"/>
           <w:sz w:val="24"/>
@@ -206,7 +213,7 @@
       </w:r>
       <w:r>
         <w:rPr>
-          <w:rFonts w:ascii="Times New Roman" w:hAnsi="Times New Roman" w:eastAsia="Times New Roman"/>
+          <w:rFonts w:ascii="Times New Roman" w:hAnsi="Times New Roman" w:eastAsia="Times New Roman" w:cs="Times New Roman"/>
           <w:b w:val="0"/>
           <w:i/>
           <w:sz w:val="24"/>
@@ -215,7 +222,7 @@
       </w:r>
       <w:r>
         <w:rPr>
-          <w:rFonts w:ascii="Times New Roman" w:hAnsi="Times New Roman" w:eastAsia="Times New Roman"/>
+          <w:rFonts w:ascii="Times New Roman" w:hAnsi="Times New Roman" w:eastAsia="Times New Roman" w:cs="Times New Roman"/>
           <w:b w:val="0"/>
           <w:i w:val="0"/>
           <w:sz w:val="24"/>
@@ -225,14 +232,16 @@
     </w:p>
     <w:p>
       <w:pPr>
-        <w:spacing w:after="120" w:before="320" w:line="264" w:lineRule="auto"/>
+        <w:keepNext/>
+        <w:spacing w:after="160" w:before="360" w:line="276" w:lineRule="auto"/>
+        <w:jc w:val="left"/>
       </w:pPr>
       <w:r>
         <w:rPr>
-          <w:rFonts w:ascii="Times New Roman" w:hAnsi="Times New Roman" w:eastAsia="Times New Roman"/>
+          <w:rFonts w:ascii="Times New Roman" w:hAnsi="Times New Roman" w:eastAsia="Times New Roman" w:cs="Times New Roman"/>
           <w:b/>
           <w:i w:val="0"/>
-          <w:sz w:val="28"/>
+          <w:sz w:val="32"/>
         </w:rPr>
         <w:t>Kullandığım şeyler</w:t>
       </w:r>
@@ -241,10 +250,11 @@
       <w:pPr>
         <w:spacing w:after="160" w:before="0" w:line="276" w:lineRule="auto"/>
         <w:ind w:firstLine="425"/>
+        <w:jc w:val="both"/>
       </w:pPr>
       <w:r>
         <w:rPr>
-          <w:rFonts w:ascii="Times New Roman" w:hAnsi="Times New Roman" w:eastAsia="Times New Roman"/>
+          <w:rFonts w:ascii="Times New Roman" w:hAnsi="Times New Roman" w:eastAsia="Times New Roman" w:cs="Times New Roman"/>
           <w:b w:val="0"/>
           <w:i w:val="0"/>
           <w:sz w:val="24"/>
@@ -253,7 +263,7 @@
       </w:r>
       <w:r>
         <w:rPr>
-          <w:rFonts w:ascii="Times New Roman" w:hAnsi="Times New Roman" w:eastAsia="Times New Roman"/>
+          <w:rFonts w:ascii="Times New Roman" w:hAnsi="Times New Roman" w:eastAsia="Times New Roman" w:cs="Times New Roman"/>
           <w:b w:val="0"/>
           <w:i/>
           <w:sz w:val="24"/>
@@ -262,7 +272,7 @@
       </w:r>
       <w:r>
         <w:rPr>
-          <w:rFonts w:ascii="Times New Roman" w:hAnsi="Times New Roman" w:eastAsia="Times New Roman"/>
+          <w:rFonts w:ascii="Times New Roman" w:hAnsi="Times New Roman" w:eastAsia="Times New Roman" w:cs="Times New Roman"/>
           <w:b w:val="0"/>
           <w:i w:val="0"/>
           <w:sz w:val="24"/>
@@ -271,7 +281,7 @@
       </w:r>
       <w:r>
         <w:rPr>
-          <w:rFonts w:ascii="Times New Roman" w:hAnsi="Times New Roman" w:eastAsia="Times New Roman"/>
+          <w:rFonts w:ascii="Times New Roman" w:hAnsi="Times New Roman" w:eastAsia="Times New Roman" w:cs="Times New Roman"/>
           <w:b w:val="0"/>
           <w:i/>
           <w:sz w:val="24"/>
@@ -280,7 +290,7 @@
       </w:r>
       <w:r>
         <w:rPr>
-          <w:rFonts w:ascii="Times New Roman" w:hAnsi="Times New Roman" w:eastAsia="Times New Roman"/>
+          <w:rFonts w:ascii="Times New Roman" w:hAnsi="Times New Roman" w:eastAsia="Times New Roman" w:cs="Times New Roman"/>
           <w:b w:val="0"/>
           <w:i w:val="0"/>
           <w:sz w:val="24"/>
@@ -289,7 +299,7 @@
       </w:r>
       <w:r>
         <w:rPr>
-          <w:rFonts w:ascii="Times New Roman" w:hAnsi="Times New Roman" w:eastAsia="Times New Roman"/>
+          <w:rFonts w:ascii="Times New Roman" w:hAnsi="Times New Roman" w:eastAsia="Times New Roman" w:cs="Times New Roman"/>
           <w:b w:val="0"/>
           <w:i/>
           <w:sz w:val="24"/>
@@ -298,7 +308,7 @@
       </w:r>
       <w:r>
         <w:rPr>
-          <w:rFonts w:ascii="Times New Roman" w:hAnsi="Times New Roman" w:eastAsia="Times New Roman"/>
+          <w:rFonts w:ascii="Times New Roman" w:hAnsi="Times New Roman" w:eastAsia="Times New Roman" w:cs="Times New Roman"/>
           <w:b w:val="0"/>
           <w:i w:val="0"/>
           <w:sz w:val="24"/>
@@ -307,7 +317,7 @@
       </w:r>
       <w:r>
         <w:rPr>
-          <w:rFonts w:ascii="Times New Roman" w:hAnsi="Times New Roman" w:eastAsia="Times New Roman"/>
+          <w:rFonts w:ascii="Times New Roman" w:hAnsi="Times New Roman" w:eastAsia="Times New Roman" w:cs="Times New Roman"/>
           <w:b w:val="0"/>
           <w:i/>
           <w:sz w:val="24"/>
@@ -316,7 +326,7 @@
       </w:r>
       <w:r>
         <w:rPr>
-          <w:rFonts w:ascii="Times New Roman" w:hAnsi="Times New Roman" w:eastAsia="Times New Roman"/>
+          <w:rFonts w:ascii="Times New Roman" w:hAnsi="Times New Roman" w:eastAsia="Times New Roman" w:cs="Times New Roman"/>
           <w:b w:val="0"/>
           <w:i w:val="0"/>
           <w:sz w:val="24"/>
@@ -328,10 +338,11 @@
       <w:pPr>
         <w:spacing w:after="160" w:before="0" w:line="276" w:lineRule="auto"/>
         <w:ind w:firstLine="425"/>
+        <w:jc w:val="both"/>
       </w:pPr>
       <w:r>
         <w:rPr>
-          <w:rFonts w:ascii="Times New Roman" w:hAnsi="Times New Roman" w:eastAsia="Times New Roman"/>
+          <w:rFonts w:ascii="Times New Roman" w:hAnsi="Times New Roman" w:eastAsia="Times New Roman" w:cs="Times New Roman"/>
           <w:b w:val="0"/>
           <w:i w:val="0"/>
           <w:sz w:val="24"/>
@@ -340,7 +351,7 @@
       </w:r>
       <w:r>
         <w:rPr>
-          <w:rFonts w:ascii="Times New Roman" w:hAnsi="Times New Roman" w:eastAsia="Times New Roman"/>
+          <w:rFonts w:ascii="Times New Roman" w:hAnsi="Times New Roman" w:eastAsia="Times New Roman" w:cs="Times New Roman"/>
           <w:b w:val="0"/>
           <w:i/>
           <w:sz w:val="24"/>
@@ -349,7 +360,7 @@
       </w:r>
       <w:r>
         <w:rPr>
-          <w:rFonts w:ascii="Times New Roman" w:hAnsi="Times New Roman" w:eastAsia="Times New Roman"/>
+          <w:rFonts w:ascii="Times New Roman" w:hAnsi="Times New Roman" w:eastAsia="Times New Roman" w:cs="Times New Roman"/>
           <w:b w:val="0"/>
           <w:i w:val="0"/>
           <w:sz w:val="24"/>
@@ -358,7 +369,7 @@
       </w:r>
       <w:r>
         <w:rPr>
-          <w:rFonts w:ascii="Times New Roman" w:hAnsi="Times New Roman" w:eastAsia="Times New Roman"/>
+          <w:rFonts w:ascii="Times New Roman" w:hAnsi="Times New Roman" w:eastAsia="Times New Roman" w:cs="Times New Roman"/>
           <w:b w:val="0"/>
           <w:i/>
           <w:sz w:val="24"/>
@@ -367,7 +378,7 @@
       </w:r>
       <w:r>
         <w:rPr>
-          <w:rFonts w:ascii="Times New Roman" w:hAnsi="Times New Roman" w:eastAsia="Times New Roman"/>
+          <w:rFonts w:ascii="Times New Roman" w:hAnsi="Times New Roman" w:eastAsia="Times New Roman" w:cs="Times New Roman"/>
           <w:b w:val="0"/>
           <w:i w:val="0"/>
           <w:sz w:val="24"/>
@@ -376,7 +387,7 @@
       </w:r>
       <w:r>
         <w:rPr>
-          <w:rFonts w:ascii="Times New Roman" w:hAnsi="Times New Roman" w:eastAsia="Times New Roman"/>
+          <w:rFonts w:ascii="Times New Roman" w:hAnsi="Times New Roman" w:eastAsia="Times New Roman" w:cs="Times New Roman"/>
           <w:b w:val="0"/>
           <w:i/>
           <w:sz w:val="24"/>
@@ -385,7 +396,7 @@
       </w:r>
       <w:r>
         <w:rPr>
-          <w:rFonts w:ascii="Times New Roman" w:hAnsi="Times New Roman" w:eastAsia="Times New Roman"/>
+          <w:rFonts w:ascii="Times New Roman" w:hAnsi="Times New Roman" w:eastAsia="Times New Roman" w:cs="Times New Roman"/>
           <w:b w:val="0"/>
           <w:i w:val="0"/>
           <w:sz w:val="24"/>
@@ -395,14 +406,16 @@
     </w:p>
     <w:p>
       <w:pPr>
-        <w:spacing w:after="120" w:before="320" w:line="264" w:lineRule="auto"/>
+        <w:keepNext/>
+        <w:spacing w:after="160" w:before="360" w:line="276" w:lineRule="auto"/>
+        <w:jc w:val="left"/>
       </w:pPr>
       <w:r>
         <w:rPr>
-          <w:rFonts w:ascii="Times New Roman" w:hAnsi="Times New Roman" w:eastAsia="Times New Roman"/>
+          <w:rFonts w:ascii="Times New Roman" w:hAnsi="Times New Roman" w:eastAsia="Times New Roman" w:cs="Times New Roman"/>
           <w:b/>
           <w:i w:val="0"/>
-          <w:sz w:val="28"/>
+          <w:sz w:val="32"/>
         </w:rPr>
         <w:t>Veritabanı: üç tablo</w:t>
       </w:r>
@@ -411,10 +424,11 @@
       <w:pPr>
         <w:spacing w:after="160" w:before="0" w:line="276" w:lineRule="auto"/>
         <w:ind w:firstLine="425"/>
+        <w:jc w:val="both"/>
       </w:pPr>
       <w:r>
         <w:rPr>
-          <w:rFonts w:ascii="Times New Roman" w:hAnsi="Times New Roman" w:eastAsia="Times New Roman"/>
+          <w:rFonts w:ascii="Times New Roman" w:hAnsi="Times New Roman" w:eastAsia="Times New Roman" w:cs="Times New Roman"/>
           <w:b w:val="0"/>
           <w:i w:val="0"/>
           <w:sz w:val="24"/>
@@ -424,11 +438,12 @@
     </w:p>
     <w:p>
       <w:pPr>
-        <w:spacing w:after="120" w:before="0" w:line="276" w:lineRule="auto"/>
+        <w:spacing w:after="160" w:before="0" w:line="276" w:lineRule="auto"/>
+        <w:jc w:val="both"/>
       </w:pPr>
       <w:r>
         <w:rPr>
-          <w:rFonts w:ascii="Times New Roman" w:hAnsi="Times New Roman" w:eastAsia="Times New Roman"/>
+          <w:rFonts w:ascii="Times New Roman" w:hAnsi="Times New Roman" w:eastAsia="Times New Roman" w:cs="Times New Roman"/>
           <w:b/>
           <w:i w:val="0"/>
           <w:sz w:val="24"/>
@@ -437,7 +452,7 @@
       </w:r>
       <w:r>
         <w:rPr>
-          <w:rFonts w:ascii="Times New Roman" w:hAnsi="Times New Roman" w:eastAsia="Times New Roman"/>
+          <w:rFonts w:ascii="Times New Roman" w:hAnsi="Times New Roman" w:eastAsia="Times New Roman" w:cs="Times New Roman"/>
           <w:b w:val="0"/>
           <w:i w:val="0"/>
           <w:sz w:val="24"/>
@@ -446,7 +461,7 @@
       </w:r>
       <w:r>
         <w:rPr>
-          <w:rFonts w:ascii="Times New Roman" w:hAnsi="Times New Roman" w:eastAsia="Times New Roman"/>
+          <w:rFonts w:ascii="Times New Roman" w:hAnsi="Times New Roman" w:eastAsia="Times New Roman" w:cs="Times New Roman"/>
           <w:b/>
           <w:i w:val="0"/>
           <w:sz w:val="24"/>
@@ -455,7 +470,7 @@
       </w:r>
       <w:r>
         <w:rPr>
-          <w:rFonts w:ascii="Times New Roman" w:hAnsi="Times New Roman" w:eastAsia="Times New Roman"/>
+          <w:rFonts w:ascii="Times New Roman" w:hAnsi="Times New Roman" w:eastAsia="Times New Roman" w:cs="Times New Roman"/>
           <w:b w:val="0"/>
           <w:i w:val="0"/>
           <w:sz w:val="24"/>
@@ -465,11 +480,12 @@
     </w:p>
     <w:p>
       <w:pPr>
-        <w:spacing w:after="120" w:before="0" w:line="276" w:lineRule="auto"/>
+        <w:spacing w:after="160" w:before="0" w:line="276" w:lineRule="auto"/>
+        <w:jc w:val="both"/>
       </w:pPr>
       <w:r>
         <w:rPr>
-          <w:rFonts w:ascii="Times New Roman" w:hAnsi="Times New Roman" w:eastAsia="Times New Roman"/>
+          <w:rFonts w:ascii="Times New Roman" w:hAnsi="Times New Roman" w:eastAsia="Times New Roman" w:cs="Times New Roman"/>
           <w:b/>
           <w:i w:val="0"/>
           <w:sz w:val="24"/>
@@ -478,7 +494,7 @@
       </w:r>
       <w:r>
         <w:rPr>
-          <w:rFonts w:ascii="Times New Roman" w:hAnsi="Times New Roman" w:eastAsia="Times New Roman"/>
+          <w:rFonts w:ascii="Times New Roman" w:hAnsi="Times New Roman" w:eastAsia="Times New Roman" w:cs="Times New Roman"/>
           <w:b w:val="0"/>
           <w:i w:val="0"/>
           <w:sz w:val="24"/>
@@ -489,10 +505,11 @@
     <w:p>
       <w:pPr>
         <w:spacing w:after="160" w:before="0" w:line="276" w:lineRule="auto"/>
+        <w:jc w:val="both"/>
       </w:pPr>
       <w:r>
         <w:rPr>
-          <w:rFonts w:ascii="Times New Roman" w:hAnsi="Times New Roman" w:eastAsia="Times New Roman"/>
+          <w:rFonts w:ascii="Times New Roman" w:hAnsi="Times New Roman" w:eastAsia="Times New Roman" w:cs="Times New Roman"/>
           <w:b/>
           <w:i w:val="0"/>
           <w:sz w:val="24"/>
@@ -501,7 +518,7 @@
       </w:r>
       <w:r>
         <w:rPr>
-          <w:rFonts w:ascii="Times New Roman" w:hAnsi="Times New Roman" w:eastAsia="Times New Roman"/>
+          <w:rFonts w:ascii="Times New Roman" w:hAnsi="Times New Roman" w:eastAsia="Times New Roman" w:cs="Times New Roman"/>
           <w:b w:val="0"/>
           <w:i w:val="0"/>
           <w:sz w:val="24"/>
@@ -513,10 +530,11 @@
       <w:pPr>
         <w:spacing w:after="160" w:before="0" w:line="276" w:lineRule="auto"/>
         <w:ind w:firstLine="425"/>
+        <w:jc w:val="both"/>
       </w:pPr>
       <w:r>
         <w:rPr>
-          <w:rFonts w:ascii="Times New Roman" w:hAnsi="Times New Roman" w:eastAsia="Times New Roman"/>
+          <w:rFonts w:ascii="Times New Roman" w:hAnsi="Times New Roman" w:eastAsia="Times New Roman" w:cs="Times New Roman"/>
           <w:b w:val="0"/>
           <w:i w:val="0"/>
           <w:sz w:val="24"/>
@@ -525,7 +543,7 @@
       </w:r>
       <w:r>
         <w:rPr>
-          <w:rFonts w:ascii="Times New Roman" w:hAnsi="Times New Roman" w:eastAsia="Times New Roman"/>
+          <w:rFonts w:ascii="Times New Roman" w:hAnsi="Times New Roman" w:eastAsia="Times New Roman" w:cs="Times New Roman"/>
           <w:b w:val="0"/>
           <w:i/>
           <w:sz w:val="24"/>
@@ -534,7 +552,7 @@
       </w:r>
       <w:r>
         <w:rPr>
-          <w:rFonts w:ascii="Times New Roman" w:hAnsi="Times New Roman" w:eastAsia="Times New Roman"/>
+          <w:rFonts w:ascii="Times New Roman" w:hAnsi="Times New Roman" w:eastAsia="Times New Roman" w:cs="Times New Roman"/>
           <w:b w:val="0"/>
           <w:i w:val="0"/>
           <w:sz w:val="24"/>
@@ -544,14 +562,16 @@
     </w:p>
     <w:p>
       <w:pPr>
-        <w:spacing w:after="120" w:before="320" w:line="264" w:lineRule="auto"/>
+        <w:keepNext/>
+        <w:spacing w:after="160" w:before="360" w:line="276" w:lineRule="auto"/>
+        <w:jc w:val="left"/>
       </w:pPr>
       <w:r>
         <w:rPr>
-          <w:rFonts w:ascii="Times New Roman" w:hAnsi="Times New Roman" w:eastAsia="Times New Roman"/>
+          <w:rFonts w:ascii="Times New Roman" w:hAnsi="Times New Roman" w:eastAsia="Times New Roman" w:cs="Times New Roman"/>
           <w:b/>
           <w:i w:val="0"/>
-          <w:sz w:val="28"/>
+          <w:sz w:val="32"/>
         </w:rPr>
         <w:t>Çakışma (en çok uğraştığım kısım)</w:t>
       </w:r>
@@ -560,10 +580,11 @@
       <w:pPr>
         <w:spacing w:after="160" w:before="0" w:line="276" w:lineRule="auto"/>
         <w:ind w:firstLine="425"/>
+        <w:jc w:val="both"/>
       </w:pPr>
       <w:r>
         <w:rPr>
-          <w:rFonts w:ascii="Times New Roman" w:hAnsi="Times New Roman" w:eastAsia="Times New Roman"/>
+          <w:rFonts w:ascii="Times New Roman" w:hAnsi="Times New Roman" w:eastAsia="Times New Roman" w:cs="Times New Roman"/>
           <w:b w:val="0"/>
           <w:i w:val="0"/>
           <w:sz w:val="24"/>
@@ -573,12 +594,13 @@
     </w:p>
     <w:p>
       <w:pPr>
-        <w:spacing w:after="80" w:before="0" w:line="276" w:lineRule="auto"/>
+        <w:spacing w:after="160" w:before="0" w:line="276" w:lineRule="auto"/>
         <w:ind w:firstLine="425"/>
+        <w:jc w:val="both"/>
       </w:pPr>
       <w:r>
         <w:rPr>
-          <w:rFonts w:ascii="Times New Roman" w:hAnsi="Times New Roman" w:eastAsia="Times New Roman"/>
+          <w:rFonts w:ascii="Times New Roman" w:hAnsi="Times New Roman" w:eastAsia="Times New Roman" w:cs="Times New Roman"/>
           <w:b w:val="0"/>
           <w:i w:val="0"/>
           <w:sz w:val="24"/>
@@ -588,13 +610,14 @@
     </w:p>
     <w:p>
       <w:pPr>
-        <w:spacing w:after="200" w:before="80" w:line="240" w:lineRule="auto"/>
+        <w:spacing w:after="200" w:before="160" w:line="240" w:lineRule="auto"/>
         <w:ind w:left="340"/>
         <w:shd w:fill="F4F1EA" w:val="clear"/>
+        <w:jc w:val="left"/>
       </w:pPr>
       <w:r>
         <w:rPr>
-          <w:rFonts w:ascii="Consolas" w:hAnsi="Consolas" w:eastAsia="Consolas"/>
+          <w:rFonts w:ascii="Consolas" w:hAnsi="Consolas" w:eastAsia="Consolas" w:cs="Consolas"/>
           <w:b w:val="0"/>
           <w:i w:val="0"/>
           <w:color w:val="222222"/>
@@ -611,10 +634,11 @@
       <w:pPr>
         <w:spacing w:after="160" w:before="0" w:line="276" w:lineRule="auto"/>
         <w:ind w:firstLine="425"/>
+        <w:jc w:val="both"/>
       </w:pPr>
       <w:r>
         <w:rPr>
-          <w:rFonts w:ascii="Times New Roman" w:hAnsi="Times New Roman" w:eastAsia="Times New Roman"/>
+          <w:rFonts w:ascii="Times New Roman" w:hAnsi="Times New Roman" w:eastAsia="Times New Roman" w:cs="Times New Roman"/>
           <w:b w:val="0"/>
           <w:i w:val="0"/>
           <w:sz w:val="24"/>
@@ -624,11 +648,12 @@
     </w:p>
     <w:p>
       <w:pPr>
-        <w:spacing w:after="80" w:before="0" w:line="276" w:lineRule="auto"/>
+        <w:spacing w:after="160" w:before="0" w:line="276" w:lineRule="auto"/>
+        <w:jc w:val="both"/>
       </w:pPr>
       <w:r>
         <w:rPr>
-          <w:rFonts w:ascii="Times New Roman" w:hAnsi="Times New Roman" w:eastAsia="Times New Roman"/>
+          <w:rFonts w:ascii="Times New Roman" w:hAnsi="Times New Roman" w:eastAsia="Times New Roman" w:cs="Times New Roman"/>
           <w:b w:val="0"/>
           <w:i w:val="0"/>
           <w:sz w:val="24"/>
@@ -638,11 +663,12 @@
     </w:p>
     <w:p>
       <w:pPr>
-        <w:spacing w:after="40" w:before="0" w:line="276" w:lineRule="auto"/>
+        <w:spacing w:after="80" w:before="0" w:line="276" w:lineRule="auto"/>
+        <w:jc w:val="both"/>
       </w:pPr>
       <w:r>
         <w:rPr>
-          <w:rFonts w:ascii="Times New Roman" w:hAnsi="Times New Roman" w:eastAsia="Times New Roman"/>
+          <w:rFonts w:ascii="Times New Roman" w:hAnsi="Times New Roman" w:eastAsia="Times New Roman" w:cs="Times New Roman"/>
           <w:b/>
           <w:i w:val="0"/>
           <w:sz w:val="24"/>
@@ -651,7 +677,7 @@
       </w:r>
       <w:r>
         <w:rPr>
-          <w:rFonts w:ascii="Times New Roman" w:hAnsi="Times New Roman" w:eastAsia="Times New Roman"/>
+          <w:rFonts w:ascii="Times New Roman" w:hAnsi="Times New Roman" w:eastAsia="Times New Roman" w:cs="Times New Roman"/>
           <w:b w:val="0"/>
           <w:i/>
           <w:sz w:val="24"/>
@@ -660,7 +686,7 @@
       </w:r>
       <w:r>
         <w:rPr>
-          <w:rFonts w:ascii="Times New Roman" w:hAnsi="Times New Roman" w:eastAsia="Times New Roman"/>
+          <w:rFonts w:ascii="Times New Roman" w:hAnsi="Times New Roman" w:eastAsia="Times New Roman" w:cs="Times New Roman"/>
           <w:b w:val="0"/>
           <w:i w:val="0"/>
           <w:sz w:val="24"/>
@@ -670,11 +696,12 @@
     </w:p>
     <w:p>
       <w:pPr>
-        <w:spacing w:after="40" w:before="0" w:line="276" w:lineRule="auto"/>
+        <w:spacing w:after="80" w:before="0" w:line="276" w:lineRule="auto"/>
+        <w:jc w:val="both"/>
       </w:pPr>
       <w:r>
         <w:rPr>
-          <w:rFonts w:ascii="Times New Roman" w:hAnsi="Times New Roman" w:eastAsia="Times New Roman"/>
+          <w:rFonts w:ascii="Times New Roman" w:hAnsi="Times New Roman" w:eastAsia="Times New Roman" w:cs="Times New Roman"/>
           <w:b/>
           <w:i w:val="0"/>
           <w:sz w:val="24"/>
@@ -683,7 +710,7 @@
       </w:r>
       <w:r>
         <w:rPr>
-          <w:rFonts w:ascii="Times New Roman" w:hAnsi="Times New Roman" w:eastAsia="Times New Roman"/>
+          <w:rFonts w:ascii="Times New Roman" w:hAnsi="Times New Roman" w:eastAsia="Times New Roman" w:cs="Times New Roman"/>
           <w:b w:val="0"/>
           <w:i/>
           <w:sz w:val="24"/>
@@ -692,7 +719,7 @@
       </w:r>
       <w:r>
         <w:rPr>
-          <w:rFonts w:ascii="Times New Roman" w:hAnsi="Times New Roman" w:eastAsia="Times New Roman"/>
+          <w:rFonts w:ascii="Times New Roman" w:hAnsi="Times New Roman" w:eastAsia="Times New Roman" w:cs="Times New Roman"/>
           <w:b w:val="0"/>
           <w:i w:val="0"/>
           <w:sz w:val="24"/>
@@ -702,11 +729,12 @@
     </w:p>
     <w:p>
       <w:pPr>
-        <w:spacing w:after="160" w:before="0" w:line="276" w:lineRule="auto"/>
+        <w:spacing w:after="80" w:before="0" w:line="276" w:lineRule="auto"/>
+        <w:jc w:val="both"/>
       </w:pPr>
       <w:r>
         <w:rPr>
-          <w:rFonts w:ascii="Times New Roman" w:hAnsi="Times New Roman" w:eastAsia="Times New Roman"/>
+          <w:rFonts w:ascii="Times New Roman" w:hAnsi="Times New Roman" w:eastAsia="Times New Roman" w:cs="Times New Roman"/>
           <w:b/>
           <w:i w:val="0"/>
           <w:sz w:val="24"/>
@@ -715,7 +743,7 @@
       </w:r>
       <w:r>
         <w:rPr>
-          <w:rFonts w:ascii="Times New Roman" w:hAnsi="Times New Roman" w:eastAsia="Times New Roman"/>
+          <w:rFonts w:ascii="Times New Roman" w:hAnsi="Times New Roman" w:eastAsia="Times New Roman" w:cs="Times New Roman"/>
           <w:b w:val="0"/>
           <w:i/>
           <w:sz w:val="24"/>
@@ -724,7 +752,7 @@
       </w:r>
       <w:r>
         <w:rPr>
-          <w:rFonts w:ascii="Times New Roman" w:hAnsi="Times New Roman" w:eastAsia="Times New Roman"/>
+          <w:rFonts w:ascii="Times New Roman" w:hAnsi="Times New Roman" w:eastAsia="Times New Roman" w:cs="Times New Roman"/>
           <w:b w:val="0"/>
           <w:i w:val="0"/>
           <w:sz w:val="24"/>
@@ -736,10 +764,11 @@
       <w:pPr>
         <w:spacing w:after="160" w:before="0" w:line="276" w:lineRule="auto"/>
         <w:ind w:firstLine="425"/>
+        <w:jc w:val="both"/>
       </w:pPr>
       <w:r>
         <w:rPr>
-          <w:rFonts w:ascii="Times New Roman" w:hAnsi="Times New Roman" w:eastAsia="Times New Roman"/>
+          <w:rFonts w:ascii="Times New Roman" w:hAnsi="Times New Roman" w:eastAsia="Times New Roman" w:cs="Times New Roman"/>
           <w:b w:val="0"/>
           <w:i w:val="0"/>
           <w:sz w:val="24"/>
@@ -748,7 +777,7 @@
       </w:r>
       <w:r>
         <w:rPr>
-          <w:rFonts w:ascii="Times New Roman" w:hAnsi="Times New Roman" w:eastAsia="Times New Roman"/>
+          <w:rFonts w:ascii="Times New Roman" w:hAnsi="Times New Roman" w:eastAsia="Times New Roman" w:cs="Times New Roman"/>
           <w:b w:val="0"/>
           <w:i/>
           <w:sz w:val="24"/>
@@ -757,7 +786,7 @@
       </w:r>
       <w:r>
         <w:rPr>
-          <w:rFonts w:ascii="Times New Roman" w:hAnsi="Times New Roman" w:eastAsia="Times New Roman"/>
+          <w:rFonts w:ascii="Times New Roman" w:hAnsi="Times New Roman" w:eastAsia="Times New Roman" w:cs="Times New Roman"/>
           <w:b w:val="0"/>
           <w:i w:val="0"/>
           <w:sz w:val="24"/>
@@ -769,10 +798,11 @@
       <w:pPr>
         <w:spacing w:after="160" w:before="0" w:line="276" w:lineRule="auto"/>
         <w:ind w:firstLine="425"/>
+        <w:jc w:val="both"/>
       </w:pPr>
       <w:r>
         <w:rPr>
-          <w:rFonts w:ascii="Times New Roman" w:hAnsi="Times New Roman" w:eastAsia="Times New Roman"/>
+          <w:rFonts w:ascii="Times New Roman" w:hAnsi="Times New Roman" w:eastAsia="Times New Roman" w:cs="Times New Roman"/>
           <w:b w:val="0"/>
           <w:i w:val="0"/>
           <w:sz w:val="24"/>
@@ -782,14 +812,16 @@
     </w:p>
     <w:p>
       <w:pPr>
-        <w:spacing w:after="120" w:before="320" w:line="264" w:lineRule="auto"/>
+        <w:keepNext/>
+        <w:spacing w:after="160" w:before="360" w:line="276" w:lineRule="auto"/>
+        <w:jc w:val="left"/>
       </w:pPr>
       <w:r>
         <w:rPr>
-          <w:rFonts w:ascii="Times New Roman" w:hAnsi="Times New Roman" w:eastAsia="Times New Roman"/>
+          <w:rFonts w:ascii="Times New Roman" w:hAnsi="Times New Roman" w:eastAsia="Times New Roman" w:cs="Times New Roman"/>
           <w:b/>
           <w:i w:val="0"/>
-          <w:sz w:val="28"/>
+          <w:sz w:val="32"/>
         </w:rPr>
         <w:t>FOR UPDATE — neden “önce bak sonra yaz” yetmedi</w:t>
       </w:r>
@@ -798,10 +830,11 @@
       <w:pPr>
         <w:spacing w:after="160" w:before="0" w:line="276" w:lineRule="auto"/>
         <w:ind w:firstLine="425"/>
+        <w:jc w:val="both"/>
       </w:pPr>
       <w:r>
         <w:rPr>
-          <w:rFonts w:ascii="Times New Roman" w:hAnsi="Times New Roman" w:eastAsia="Times New Roman"/>
+          <w:rFonts w:ascii="Times New Roman" w:hAnsi="Times New Roman" w:eastAsia="Times New Roman" w:cs="Times New Roman"/>
           <w:b w:val="0"/>
           <w:i w:val="0"/>
           <w:sz w:val="24"/>
@@ -811,11 +844,12 @@
     </w:p>
     <w:p>
       <w:pPr>
-        <w:spacing w:after="40" w:before="0" w:line="276" w:lineRule="auto"/>
+        <w:spacing w:after="80" w:before="0" w:line="276" w:lineRule="auto"/>
+        <w:jc w:val="both"/>
       </w:pPr>
       <w:r>
         <w:rPr>
-          <w:rFonts w:ascii="Times New Roman" w:hAnsi="Times New Roman" w:eastAsia="Times New Roman"/>
+          <w:rFonts w:ascii="Times New Roman" w:hAnsi="Times New Roman" w:eastAsia="Times New Roman" w:cs="Times New Roman"/>
           <w:b/>
           <w:i w:val="0"/>
           <w:sz w:val="24"/>
@@ -824,7 +858,7 @@
       </w:r>
       <w:r>
         <w:rPr>
-          <w:rFonts w:ascii="Times New Roman" w:hAnsi="Times New Roman" w:eastAsia="Times New Roman"/>
+          <w:rFonts w:ascii="Times New Roman" w:hAnsi="Times New Roman" w:eastAsia="Times New Roman" w:cs="Times New Roman"/>
           <w:b w:val="0"/>
           <w:i w:val="0"/>
           <w:sz w:val="24"/>
@@ -834,11 +868,12 @@
     </w:p>
     <w:p>
       <w:pPr>
-        <w:spacing w:after="40" w:before="0" w:line="276" w:lineRule="auto"/>
+        <w:spacing w:after="80" w:before="0" w:line="276" w:lineRule="auto"/>
+        <w:jc w:val="both"/>
       </w:pPr>
       <w:r>
         <w:rPr>
-          <w:rFonts w:ascii="Times New Roman" w:hAnsi="Times New Roman" w:eastAsia="Times New Roman"/>
+          <w:rFonts w:ascii="Times New Roman" w:hAnsi="Times New Roman" w:eastAsia="Times New Roman" w:cs="Times New Roman"/>
           <w:b/>
           <w:i w:val="0"/>
           <w:sz w:val="24"/>
@@ -847,7 +882,7 @@
       </w:r>
       <w:r>
         <w:rPr>
-          <w:rFonts w:ascii="Times New Roman" w:hAnsi="Times New Roman" w:eastAsia="Times New Roman"/>
+          <w:rFonts w:ascii="Times New Roman" w:hAnsi="Times New Roman" w:eastAsia="Times New Roman" w:cs="Times New Roman"/>
           <w:b w:val="0"/>
           <w:i w:val="0"/>
           <w:sz w:val="24"/>
@@ -857,11 +892,12 @@
     </w:p>
     <w:p>
       <w:pPr>
-        <w:spacing w:after="40" w:before="0" w:line="276" w:lineRule="auto"/>
+        <w:spacing w:after="80" w:before="0" w:line="276" w:lineRule="auto"/>
+        <w:jc w:val="both"/>
       </w:pPr>
       <w:r>
         <w:rPr>
-          <w:rFonts w:ascii="Times New Roman" w:hAnsi="Times New Roman" w:eastAsia="Times New Roman"/>
+          <w:rFonts w:ascii="Times New Roman" w:hAnsi="Times New Roman" w:eastAsia="Times New Roman" w:cs="Times New Roman"/>
           <w:b/>
           <w:i w:val="0"/>
           <w:sz w:val="24"/>
@@ -870,7 +906,7 @@
       </w:r>
       <w:r>
         <w:rPr>
-          <w:rFonts w:ascii="Times New Roman" w:hAnsi="Times New Roman" w:eastAsia="Times New Roman"/>
+          <w:rFonts w:ascii="Times New Roman" w:hAnsi="Times New Roman" w:eastAsia="Times New Roman" w:cs="Times New Roman"/>
           <w:b w:val="0"/>
           <w:i w:val="0"/>
           <w:sz w:val="24"/>
@@ -880,11 +916,12 @@
     </w:p>
     <w:p>
       <w:pPr>
-        <w:spacing w:after="160" w:before="0" w:line="276" w:lineRule="auto"/>
+        <w:spacing w:after="80" w:before="0" w:line="276" w:lineRule="auto"/>
+        <w:jc w:val="both"/>
       </w:pPr>
       <w:r>
         <w:rPr>
-          <w:rFonts w:ascii="Times New Roman" w:hAnsi="Times New Roman" w:eastAsia="Times New Roman"/>
+          <w:rFonts w:ascii="Times New Roman" w:hAnsi="Times New Roman" w:eastAsia="Times New Roman" w:cs="Times New Roman"/>
           <w:b/>
           <w:i w:val="0"/>
           <w:sz w:val="24"/>
@@ -893,7 +930,7 @@
       </w:r>
       <w:r>
         <w:rPr>
-          <w:rFonts w:ascii="Times New Roman" w:hAnsi="Times New Roman" w:eastAsia="Times New Roman"/>
+          <w:rFonts w:ascii="Times New Roman" w:hAnsi="Times New Roman" w:eastAsia="Times New Roman" w:cs="Times New Roman"/>
           <w:b w:val="0"/>
           <w:i w:val="0"/>
           <w:sz w:val="24"/>
@@ -905,10 +942,11 @@
       <w:pPr>
         <w:spacing w:after="160" w:before="0" w:line="276" w:lineRule="auto"/>
         <w:ind w:firstLine="425"/>
+        <w:jc w:val="both"/>
       </w:pPr>
       <w:r>
         <w:rPr>
-          <w:rFonts w:ascii="Times New Roman" w:hAnsi="Times New Roman" w:eastAsia="Times New Roman"/>
+          <w:rFonts w:ascii="Times New Roman" w:hAnsi="Times New Roman" w:eastAsia="Times New Roman" w:cs="Times New Roman"/>
           <w:b w:val="0"/>
           <w:i w:val="0"/>
           <w:sz w:val="24"/>
@@ -918,14 +956,16 @@
     </w:p>
     <w:p>
       <w:pPr>
-        <w:spacing w:after="120" w:before="320" w:line="264" w:lineRule="auto"/>
+        <w:keepNext/>
+        <w:spacing w:after="160" w:before="360" w:line="276" w:lineRule="auto"/>
+        <w:jc w:val="left"/>
       </w:pPr>
       <w:r>
         <w:rPr>
-          <w:rFonts w:ascii="Times New Roman" w:hAnsi="Times New Roman" w:eastAsia="Times New Roman"/>
+          <w:rFonts w:ascii="Times New Roman" w:hAnsi="Times New Roman" w:eastAsia="Times New Roman" w:cs="Times New Roman"/>
           <w:b/>
           <w:i w:val="0"/>
-          <w:sz w:val="28"/>
+          <w:sz w:val="32"/>
         </w:rPr>
         <w:t>Güvenlik tarafı</w:t>
       </w:r>
@@ -934,10 +974,11 @@
       <w:pPr>
         <w:spacing w:after="160" w:before="0" w:line="276" w:lineRule="auto"/>
         <w:ind w:firstLine="425"/>
+        <w:jc w:val="both"/>
       </w:pPr>
       <w:r>
         <w:rPr>
-          <w:rFonts w:ascii="Times New Roman" w:hAnsi="Times New Roman" w:eastAsia="Times New Roman"/>
+          <w:rFonts w:ascii="Times New Roman" w:hAnsi="Times New Roman" w:eastAsia="Times New Roman" w:cs="Times New Roman"/>
           <w:b w:val="0"/>
           <w:i w:val="0"/>
           <w:sz w:val="24"/>
@@ -949,10 +990,11 @@
       <w:pPr>
         <w:spacing w:after="160" w:before="0" w:line="276" w:lineRule="auto"/>
         <w:ind w:firstLine="425"/>
+        <w:jc w:val="both"/>
       </w:pPr>
       <w:r>
         <w:rPr>
-          <w:rFonts w:ascii="Times New Roman" w:hAnsi="Times New Roman" w:eastAsia="Times New Roman"/>
+          <w:rFonts w:ascii="Times New Roman" w:hAnsi="Times New Roman" w:eastAsia="Times New Roman" w:cs="Times New Roman"/>
           <w:b w:val="0"/>
           <w:i w:val="0"/>
           <w:sz w:val="24"/>
@@ -961,7 +1003,7 @@
       </w:r>
       <w:r>
         <w:rPr>
-          <w:rFonts w:ascii="Times New Roman" w:hAnsi="Times New Roman" w:eastAsia="Times New Roman"/>
+          <w:rFonts w:ascii="Times New Roman" w:hAnsi="Times New Roman" w:eastAsia="Times New Roman" w:cs="Times New Roman"/>
           <w:b/>
           <w:i w:val="0"/>
           <w:sz w:val="24"/>
@@ -970,7 +1012,7 @@
       </w:r>
       <w:r>
         <w:rPr>
-          <w:rFonts w:ascii="Times New Roman" w:hAnsi="Times New Roman" w:eastAsia="Times New Roman"/>
+          <w:rFonts w:ascii="Times New Roman" w:hAnsi="Times New Roman" w:eastAsia="Times New Roman" w:cs="Times New Roman"/>
           <w:b w:val="0"/>
           <w:i w:val="0"/>
           <w:sz w:val="24"/>
@@ -982,10 +1024,11 @@
       <w:pPr>
         <w:spacing w:after="160" w:before="0" w:line="276" w:lineRule="auto"/>
         <w:ind w:firstLine="425"/>
+        <w:jc w:val="both"/>
       </w:pPr>
       <w:r>
         <w:rPr>
-          <w:rFonts w:ascii="Times New Roman" w:hAnsi="Times New Roman" w:eastAsia="Times New Roman"/>
+          <w:rFonts w:ascii="Times New Roman" w:hAnsi="Times New Roman" w:eastAsia="Times New Roman" w:cs="Times New Roman"/>
           <w:b w:val="0"/>
           <w:i w:val="0"/>
           <w:sz w:val="24"/>
@@ -994,7 +1037,7 @@
       </w:r>
       <w:r>
         <w:rPr>
-          <w:rFonts w:ascii="Times New Roman" w:hAnsi="Times New Roman" w:eastAsia="Times New Roman"/>
+          <w:rFonts w:ascii="Times New Roman" w:hAnsi="Times New Roman" w:eastAsia="Times New Roman" w:cs="Times New Roman"/>
           <w:b w:val="0"/>
           <w:i/>
           <w:sz w:val="24"/>
@@ -1003,7 +1046,7 @@
       </w:r>
       <w:r>
         <w:rPr>
-          <w:rFonts w:ascii="Times New Roman" w:hAnsi="Times New Roman" w:eastAsia="Times New Roman"/>
+          <w:rFonts w:ascii="Times New Roman" w:hAnsi="Times New Roman" w:eastAsia="Times New Roman" w:cs="Times New Roman"/>
           <w:b w:val="0"/>
           <w:i w:val="0"/>
           <w:sz w:val="24"/>
@@ -1015,10 +1058,11 @@
       <w:pPr>
         <w:spacing w:after="160" w:before="0" w:line="276" w:lineRule="auto"/>
         <w:ind w:firstLine="425"/>
+        <w:jc w:val="both"/>
       </w:pPr>
       <w:r>
         <w:rPr>
-          <w:rFonts w:ascii="Times New Roman" w:hAnsi="Times New Roman" w:eastAsia="Times New Roman"/>
+          <w:rFonts w:ascii="Times New Roman" w:hAnsi="Times New Roman" w:eastAsia="Times New Roman" w:cs="Times New Roman"/>
           <w:b w:val="0"/>
           <w:i w:val="0"/>
           <w:sz w:val="24"/>
@@ -1028,14 +1072,16 @@
     </w:p>
     <w:p>
       <w:pPr>
-        <w:spacing w:after="120" w:before="320" w:line="264" w:lineRule="auto"/>
+        <w:keepNext/>
+        <w:spacing w:after="160" w:before="360" w:line="276" w:lineRule="auto"/>
+        <w:jc w:val="left"/>
       </w:pPr>
       <w:r>
         <w:rPr>
-          <w:rFonts w:ascii="Times New Roman" w:hAnsi="Times New Roman" w:eastAsia="Times New Roman"/>
+          <w:rFonts w:ascii="Times New Roman" w:hAnsi="Times New Roman" w:eastAsia="Times New Roman" w:cs="Times New Roman"/>
           <w:b/>
           <w:i w:val="0"/>
-          <w:sz w:val="28"/>
+          <w:sz w:val="32"/>
         </w:rPr>
         <w:t>Müşteri sayfaları</w:t>
       </w:r>
@@ -1044,10 +1090,11 @@
       <w:pPr>
         <w:spacing w:after="160" w:before="0" w:line="276" w:lineRule="auto"/>
         <w:ind w:firstLine="425"/>
+        <w:jc w:val="both"/>
       </w:pPr>
       <w:r>
         <w:rPr>
-          <w:rFonts w:ascii="Times New Roman" w:hAnsi="Times New Roman" w:eastAsia="Times New Roman"/>
+          <w:rFonts w:ascii="Times New Roman" w:hAnsi="Times New Roman" w:eastAsia="Times New Roman" w:cs="Times New Roman"/>
           <w:b w:val="0"/>
           <w:i w:val="0"/>
           <w:sz w:val="24"/>
@@ -1059,10 +1106,11 @@
       <w:pPr>
         <w:spacing w:after="160" w:before="0" w:line="276" w:lineRule="auto"/>
         <w:ind w:firstLine="425"/>
+        <w:jc w:val="both"/>
       </w:pPr>
       <w:r>
         <w:rPr>
-          <w:rFonts w:ascii="Times New Roman" w:hAnsi="Times New Roman" w:eastAsia="Times New Roman"/>
+          <w:rFonts w:ascii="Times New Roman" w:hAnsi="Times New Roman" w:eastAsia="Times New Roman" w:cs="Times New Roman"/>
           <w:b w:val="0"/>
           <w:i w:val="0"/>
           <w:sz w:val="24"/>
@@ -1074,10 +1122,11 @@
       <w:pPr>
         <w:spacing w:after="160" w:before="0" w:line="276" w:lineRule="auto"/>
         <w:ind w:firstLine="425"/>
+        <w:jc w:val="both"/>
       </w:pPr>
       <w:r>
         <w:rPr>
-          <w:rFonts w:ascii="Times New Roman" w:hAnsi="Times New Roman" w:eastAsia="Times New Roman"/>
+          <w:rFonts w:ascii="Times New Roman" w:hAnsi="Times New Roman" w:eastAsia="Times New Roman" w:cs="Times New Roman"/>
           <w:b w:val="0"/>
           <w:i w:val="0"/>
           <w:sz w:val="24"/>
@@ -1089,10 +1138,11 @@
       <w:pPr>
         <w:spacing w:after="160" w:before="0" w:line="276" w:lineRule="auto"/>
         <w:ind w:firstLine="425"/>
+        <w:jc w:val="both"/>
       </w:pPr>
       <w:r>
         <w:rPr>
-          <w:rFonts w:ascii="Times New Roman" w:hAnsi="Times New Roman" w:eastAsia="Times New Roman"/>
+          <w:rFonts w:ascii="Times New Roman" w:hAnsi="Times New Roman" w:eastAsia="Times New Roman" w:cs="Times New Roman"/>
           <w:b w:val="0"/>
           <w:i w:val="0"/>
           <w:sz w:val="24"/>
@@ -1102,14 +1152,16 @@
     </w:p>
     <w:p>
       <w:pPr>
-        <w:spacing w:after="120" w:before="320" w:line="264" w:lineRule="auto"/>
+        <w:keepNext/>
+        <w:spacing w:after="160" w:before="360" w:line="276" w:lineRule="auto"/>
+        <w:jc w:val="left"/>
       </w:pPr>
       <w:r>
         <w:rPr>
-          <w:rFonts w:ascii="Times New Roman" w:hAnsi="Times New Roman" w:eastAsia="Times New Roman"/>
+          <w:rFonts w:ascii="Times New Roman" w:hAnsi="Times New Roman" w:eastAsia="Times New Roman" w:cs="Times New Roman"/>
           <w:b/>
           <w:i w:val="0"/>
-          <w:sz w:val="28"/>
+          <w:sz w:val="32"/>
         </w:rPr>
         <w:t>Admin</w:t>
       </w:r>
@@ -1118,10 +1170,11 @@
       <w:pPr>
         <w:spacing w:after="160" w:before="0" w:line="276" w:lineRule="auto"/>
         <w:ind w:firstLine="425"/>
+        <w:jc w:val="both"/>
       </w:pPr>
       <w:r>
         <w:rPr>
-          <w:rFonts w:ascii="Times New Roman" w:hAnsi="Times New Roman" w:eastAsia="Times New Roman"/>
+          <w:rFonts w:ascii="Times New Roman" w:hAnsi="Times New Roman" w:eastAsia="Times New Roman" w:cs="Times New Roman"/>
           <w:b w:val="0"/>
           <w:i w:val="0"/>
           <w:sz w:val="24"/>
@@ -1130,7 +1183,7 @@
       </w:r>
       <w:r>
         <w:rPr>
-          <w:rFonts w:ascii="Times New Roman" w:hAnsi="Times New Roman" w:eastAsia="Times New Roman"/>
+          <w:rFonts w:ascii="Times New Roman" w:hAnsi="Times New Roman" w:eastAsia="Times New Roman" w:cs="Times New Roman"/>
           <w:b/>
           <w:i w:val="0"/>
           <w:sz w:val="24"/>
@@ -1139,7 +1192,7 @@
       </w:r>
       <w:r>
         <w:rPr>
-          <w:rFonts w:ascii="Times New Roman" w:hAnsi="Times New Roman" w:eastAsia="Times New Roman"/>
+          <w:rFonts w:ascii="Times New Roman" w:hAnsi="Times New Roman" w:eastAsia="Times New Roman" w:cs="Times New Roman"/>
           <w:b w:val="0"/>
           <w:i w:val="0"/>
           <w:sz w:val="24"/>
@@ -1151,10 +1204,11 @@
       <w:pPr>
         <w:spacing w:after="160" w:before="0" w:line="276" w:lineRule="auto"/>
         <w:ind w:firstLine="425"/>
+        <w:jc w:val="both"/>
       </w:pPr>
       <w:r>
         <w:rPr>
-          <w:rFonts w:ascii="Times New Roman" w:hAnsi="Times New Roman" w:eastAsia="Times New Roman"/>
+          <w:rFonts w:ascii="Times New Roman" w:hAnsi="Times New Roman" w:eastAsia="Times New Roman" w:cs="Times New Roman"/>
           <w:b w:val="0"/>
           <w:i w:val="0"/>
           <w:sz w:val="24"/>
@@ -1166,10 +1220,11 @@
       <w:pPr>
         <w:spacing w:after="160" w:before="0" w:line="276" w:lineRule="auto"/>
         <w:ind w:firstLine="425"/>
+        <w:jc w:val="both"/>
       </w:pPr>
       <w:r>
         <w:rPr>
-          <w:rFonts w:ascii="Times New Roman" w:hAnsi="Times New Roman" w:eastAsia="Times New Roman"/>
+          <w:rFonts w:ascii="Times New Roman" w:hAnsi="Times New Roman" w:eastAsia="Times New Roman" w:cs="Times New Roman"/>
           <w:b w:val="0"/>
           <w:i w:val="0"/>
           <w:sz w:val="24"/>
@@ -1179,14 +1234,16 @@
     </w:p>
     <w:p>
       <w:pPr>
-        <w:spacing w:after="120" w:before="320" w:line="264" w:lineRule="auto"/>
+        <w:keepNext/>
+        <w:spacing w:after="160" w:before="360" w:line="276" w:lineRule="auto"/>
+        <w:jc w:val="left"/>
       </w:pPr>
       <w:r>
         <w:rPr>
-          <w:rFonts w:ascii="Times New Roman" w:hAnsi="Times New Roman" w:eastAsia="Times New Roman"/>
+          <w:rFonts w:ascii="Times New Roman" w:hAnsi="Times New Roman" w:eastAsia="Times New Roman" w:cs="Times New Roman"/>
           <w:b/>
           <w:i w:val="0"/>
-          <w:sz w:val="28"/>
+          <w:sz w:val="32"/>
         </w:rPr>
         <w:t>XAMPP’te ayağa kaldırma</w:t>
       </w:r>
@@ -1195,10 +1252,11 @@
       <w:pPr>
         <w:spacing w:after="160" w:before="0" w:line="276" w:lineRule="auto"/>
         <w:ind w:firstLine="425"/>
+        <w:jc w:val="both"/>
       </w:pPr>
       <w:r>
         <w:rPr>
-          <w:rFonts w:ascii="Times New Roman" w:hAnsi="Times New Roman" w:eastAsia="Times New Roman"/>
+          <w:rFonts w:ascii="Times New Roman" w:hAnsi="Times New Roman" w:eastAsia="Times New Roman" w:cs="Times New Roman"/>
           <w:b w:val="0"/>
           <w:i w:val="0"/>
           <w:sz w:val="24"/>
@@ -1210,10 +1268,11 @@
       <w:pPr>
         <w:spacing w:after="160" w:before="0" w:line="276" w:lineRule="auto"/>
         <w:ind w:firstLine="425"/>
+        <w:jc w:val="both"/>
       </w:pPr>
       <w:r>
         <w:rPr>
-          <w:rFonts w:ascii="Times New Roman" w:hAnsi="Times New Roman" w:eastAsia="Times New Roman"/>
+          <w:rFonts w:ascii="Times New Roman" w:hAnsi="Times New Roman" w:eastAsia="Times New Roman" w:cs="Times New Roman"/>
           <w:b w:val="0"/>
           <w:i w:val="0"/>
           <w:sz w:val="24"/>
@@ -1225,10 +1284,11 @@
       <w:pPr>
         <w:spacing w:after="160" w:before="0" w:line="276" w:lineRule="auto"/>
         <w:ind w:firstLine="425"/>
+        <w:jc w:val="both"/>
       </w:pPr>
       <w:r>
         <w:rPr>
-          <w:rFonts w:ascii="Times New Roman" w:hAnsi="Times New Roman" w:eastAsia="Times New Roman"/>
+          <w:rFonts w:ascii="Times New Roman" w:hAnsi="Times New Roman" w:eastAsia="Times New Roman" w:cs="Times New Roman"/>
           <w:b w:val="0"/>
           <w:i w:val="0"/>
           <w:sz w:val="24"/>
@@ -1240,10 +1300,11 @@
       <w:pPr>
         <w:spacing w:after="160" w:before="0" w:line="276" w:lineRule="auto"/>
         <w:ind w:firstLine="425"/>
+        <w:jc w:val="both"/>
       </w:pPr>
       <w:r>
         <w:rPr>
-          <w:rFonts w:ascii="Times New Roman" w:hAnsi="Times New Roman" w:eastAsia="Times New Roman"/>
+          <w:rFonts w:ascii="Times New Roman" w:hAnsi="Times New Roman" w:eastAsia="Times New Roman" w:cs="Times New Roman"/>
           <w:b w:val="0"/>
           <w:i w:val="0"/>
           <w:sz w:val="24"/>
@@ -1253,25 +1314,28 @@
     </w:p>
     <w:p>
       <w:pPr>
-        <w:spacing w:after="120" w:before="320" w:line="264" w:lineRule="auto"/>
+        <w:keepNext/>
+        <w:spacing w:after="160" w:before="360" w:line="276" w:lineRule="auto"/>
+        <w:jc w:val="left"/>
       </w:pPr>
       <w:r>
         <w:rPr>
-          <w:rFonts w:ascii="Times New Roman" w:hAnsi="Times New Roman" w:eastAsia="Times New Roman"/>
+          <w:rFonts w:ascii="Times New Roman" w:hAnsi="Times New Roman" w:eastAsia="Times New Roman" w:cs="Times New Roman"/>
           <w:b/>
           <w:i w:val="0"/>
-          <w:sz w:val="28"/>
+          <w:sz w:val="32"/>
         </w:rPr>
         <w:t>Dosyalar (nerede ne var)</w:t>
       </w:r>
     </w:p>
     <w:p>
       <w:pPr>
-        <w:spacing w:after="40" w:before="0" w:line="276" w:lineRule="auto"/>
+        <w:spacing w:after="80" w:before="0" w:line="276" w:lineRule="auto"/>
+        <w:jc w:val="both"/>
       </w:pPr>
       <w:r>
         <w:rPr>
-          <w:rFonts w:ascii="Times New Roman" w:hAnsi="Times New Roman" w:eastAsia="Times New Roman"/>
+          <w:rFonts w:ascii="Times New Roman" w:hAnsi="Times New Roman" w:eastAsia="Times New Roman" w:cs="Times New Roman"/>
           <w:b/>
           <w:i w:val="0"/>
           <w:sz w:val="24"/>
@@ -1280,7 +1344,7 @@
       </w:r>
       <w:r>
         <w:rPr>
-          <w:rFonts w:ascii="Times New Roman" w:hAnsi="Times New Roman" w:eastAsia="Times New Roman"/>
+          <w:rFonts w:ascii="Times New Roman" w:hAnsi="Times New Roman" w:eastAsia="Times New Roman" w:cs="Times New Roman"/>
           <w:b w:val="0"/>
           <w:i w:val="0"/>
           <w:sz w:val="24"/>
@@ -1290,11 +1354,12 @@
     </w:p>
     <w:p>
       <w:pPr>
-        <w:spacing w:after="40" w:before="0" w:line="276" w:lineRule="auto"/>
+        <w:spacing w:after="80" w:before="0" w:line="276" w:lineRule="auto"/>
+        <w:jc w:val="both"/>
       </w:pPr>
       <w:r>
         <w:rPr>
-          <w:rFonts w:ascii="Times New Roman" w:hAnsi="Times New Roman" w:eastAsia="Times New Roman"/>
+          <w:rFonts w:ascii="Times New Roman" w:hAnsi="Times New Roman" w:eastAsia="Times New Roman" w:cs="Times New Roman"/>
           <w:b/>
           <w:i w:val="0"/>
           <w:sz w:val="24"/>
@@ -1303,7 +1368,7 @@
       </w:r>
       <w:r>
         <w:rPr>
-          <w:rFonts w:ascii="Times New Roman" w:hAnsi="Times New Roman" w:eastAsia="Times New Roman"/>
+          <w:rFonts w:ascii="Times New Roman" w:hAnsi="Times New Roman" w:eastAsia="Times New Roman" w:cs="Times New Roman"/>
           <w:b w:val="0"/>
           <w:i w:val="0"/>
           <w:sz w:val="24"/>
@@ -1313,11 +1378,12 @@
     </w:p>
     <w:p>
       <w:pPr>
-        <w:spacing w:after="40" w:before="0" w:line="276" w:lineRule="auto"/>
+        <w:spacing w:after="80" w:before="0" w:line="276" w:lineRule="auto"/>
+        <w:jc w:val="both"/>
       </w:pPr>
       <w:r>
         <w:rPr>
-          <w:rFonts w:ascii="Times New Roman" w:hAnsi="Times New Roman" w:eastAsia="Times New Roman"/>
+          <w:rFonts w:ascii="Times New Roman" w:hAnsi="Times New Roman" w:eastAsia="Times New Roman" w:cs="Times New Roman"/>
           <w:b/>
           <w:i w:val="0"/>
           <w:sz w:val="24"/>
@@ -1326,7 +1392,7 @@
       </w:r>
       <w:r>
         <w:rPr>
-          <w:rFonts w:ascii="Times New Roman" w:hAnsi="Times New Roman" w:eastAsia="Times New Roman"/>
+          <w:rFonts w:ascii="Times New Roman" w:hAnsi="Times New Roman" w:eastAsia="Times New Roman" w:cs="Times New Roman"/>
           <w:b w:val="0"/>
           <w:i w:val="0"/>
           <w:sz w:val="24"/>
@@ -1336,11 +1402,12 @@
     </w:p>
     <w:p>
       <w:pPr>
-        <w:spacing w:after="40" w:before="0" w:line="276" w:lineRule="auto"/>
+        <w:spacing w:after="80" w:before="0" w:line="276" w:lineRule="auto"/>
+        <w:jc w:val="both"/>
       </w:pPr>
       <w:r>
         <w:rPr>
-          <w:rFonts w:ascii="Times New Roman" w:hAnsi="Times New Roman" w:eastAsia="Times New Roman"/>
+          <w:rFonts w:ascii="Times New Roman" w:hAnsi="Times New Roman" w:eastAsia="Times New Roman" w:cs="Times New Roman"/>
           <w:b/>
           <w:i w:val="0"/>
           <w:sz w:val="24"/>
@@ -1349,7 +1416,7 @@
       </w:r>
       <w:r>
         <w:rPr>
-          <w:rFonts w:ascii="Times New Roman" w:hAnsi="Times New Roman" w:eastAsia="Times New Roman"/>
+          <w:rFonts w:ascii="Times New Roman" w:hAnsi="Times New Roman" w:eastAsia="Times New Roman" w:cs="Times New Roman"/>
           <w:b w:val="0"/>
           <w:i w:val="0"/>
           <w:sz w:val="24"/>
@@ -1359,11 +1426,12 @@
     </w:p>
     <w:p>
       <w:pPr>
-        <w:spacing w:after="40" w:before="0" w:line="276" w:lineRule="auto"/>
+        <w:spacing w:after="80" w:before="0" w:line="276" w:lineRule="auto"/>
+        <w:jc w:val="both"/>
       </w:pPr>
       <w:r>
         <w:rPr>
-          <w:rFonts w:ascii="Times New Roman" w:hAnsi="Times New Roman" w:eastAsia="Times New Roman"/>
+          <w:rFonts w:ascii="Times New Roman" w:hAnsi="Times New Roman" w:eastAsia="Times New Roman" w:cs="Times New Roman"/>
           <w:b/>
           <w:i w:val="0"/>
           <w:sz w:val="24"/>
@@ -1372,7 +1440,7 @@
       </w:r>
       <w:r>
         <w:rPr>
-          <w:rFonts w:ascii="Times New Roman" w:hAnsi="Times New Roman" w:eastAsia="Times New Roman"/>
+          <w:rFonts w:ascii="Times New Roman" w:hAnsi="Times New Roman" w:eastAsia="Times New Roman" w:cs="Times New Roman"/>
           <w:b w:val="0"/>
           <w:i w:val="0"/>
           <w:sz w:val="24"/>
@@ -1382,11 +1450,12 @@
     </w:p>
     <w:p>
       <w:pPr>
-        <w:spacing w:after="40" w:before="0" w:line="276" w:lineRule="auto"/>
+        <w:spacing w:after="80" w:before="0" w:line="276" w:lineRule="auto"/>
+        <w:jc w:val="both"/>
       </w:pPr>
       <w:r>
         <w:rPr>
-          <w:rFonts w:ascii="Times New Roman" w:hAnsi="Times New Roman" w:eastAsia="Times New Roman"/>
+          <w:rFonts w:ascii="Times New Roman" w:hAnsi="Times New Roman" w:eastAsia="Times New Roman" w:cs="Times New Roman"/>
           <w:b/>
           <w:i w:val="0"/>
           <w:sz w:val="24"/>
@@ -1395,7 +1464,7 @@
       </w:r>
       <w:r>
         <w:rPr>
-          <w:rFonts w:ascii="Times New Roman" w:hAnsi="Times New Roman" w:eastAsia="Times New Roman"/>
+          <w:rFonts w:ascii="Times New Roman" w:hAnsi="Times New Roman" w:eastAsia="Times New Roman" w:cs="Times New Roman"/>
           <w:b w:val="0"/>
           <w:i w:val="0"/>
           <w:sz w:val="24"/>
@@ -1405,11 +1474,12 @@
     </w:p>
     <w:p>
       <w:pPr>
-        <w:spacing w:after="40" w:before="0" w:line="276" w:lineRule="auto"/>
+        <w:spacing w:after="80" w:before="0" w:line="276" w:lineRule="auto"/>
+        <w:jc w:val="both"/>
       </w:pPr>
       <w:r>
         <w:rPr>
-          <w:rFonts w:ascii="Times New Roman" w:hAnsi="Times New Roman" w:eastAsia="Times New Roman"/>
+          <w:rFonts w:ascii="Times New Roman" w:hAnsi="Times New Roman" w:eastAsia="Times New Roman" w:cs="Times New Roman"/>
           <w:b/>
           <w:i w:val="0"/>
           <w:sz w:val="24"/>
@@ -1418,7 +1488,7 @@
       </w:r>
       <w:r>
         <w:rPr>
-          <w:rFonts w:ascii="Times New Roman" w:hAnsi="Times New Roman" w:eastAsia="Times New Roman"/>
+          <w:rFonts w:ascii="Times New Roman" w:hAnsi="Times New Roman" w:eastAsia="Times New Roman" w:cs="Times New Roman"/>
           <w:b w:val="0"/>
           <w:i w:val="0"/>
           <w:sz w:val="24"/>
@@ -1428,11 +1498,12 @@
     </w:p>
     <w:p>
       <w:pPr>
-        <w:spacing w:after="40" w:before="0" w:line="276" w:lineRule="auto"/>
+        <w:spacing w:after="80" w:before="0" w:line="276" w:lineRule="auto"/>
+        <w:jc w:val="both"/>
       </w:pPr>
       <w:r>
         <w:rPr>
-          <w:rFonts w:ascii="Times New Roman" w:hAnsi="Times New Roman" w:eastAsia="Times New Roman"/>
+          <w:rFonts w:ascii="Times New Roman" w:hAnsi="Times New Roman" w:eastAsia="Times New Roman" w:cs="Times New Roman"/>
           <w:b/>
           <w:i w:val="0"/>
           <w:sz w:val="24"/>
@@ -1441,7 +1512,7 @@
       </w:r>
       <w:r>
         <w:rPr>
-          <w:rFonts w:ascii="Times New Roman" w:hAnsi="Times New Roman" w:eastAsia="Times New Roman"/>
+          <w:rFonts w:ascii="Times New Roman" w:hAnsi="Times New Roman" w:eastAsia="Times New Roman" w:cs="Times New Roman"/>
           <w:b w:val="0"/>
           <w:i w:val="0"/>
           <w:sz w:val="24"/>
@@ -1451,11 +1522,12 @@
     </w:p>
     <w:p>
       <w:pPr>
-        <w:spacing w:after="40" w:before="0" w:line="276" w:lineRule="auto"/>
+        <w:spacing w:after="80" w:before="0" w:line="276" w:lineRule="auto"/>
+        <w:jc w:val="both"/>
       </w:pPr>
       <w:r>
         <w:rPr>
-          <w:rFonts w:ascii="Times New Roman" w:hAnsi="Times New Roman" w:eastAsia="Times New Roman"/>
+          <w:rFonts w:ascii="Times New Roman" w:hAnsi="Times New Roman" w:eastAsia="Times New Roman" w:cs="Times New Roman"/>
           <w:b/>
           <w:i w:val="0"/>
           <w:sz w:val="24"/>
@@ -1464,7 +1536,7 @@
       </w:r>
       <w:r>
         <w:rPr>
-          <w:rFonts w:ascii="Times New Roman" w:hAnsi="Times New Roman" w:eastAsia="Times New Roman"/>
+          <w:rFonts w:ascii="Times New Roman" w:hAnsi="Times New Roman" w:eastAsia="Times New Roman" w:cs="Times New Roman"/>
           <w:b w:val="0"/>
           <w:i w:val="0"/>
           <w:sz w:val="24"/>
@@ -1474,11 +1546,12 @@
     </w:p>
     <w:p>
       <w:pPr>
-        <w:spacing w:after="40" w:before="0" w:line="276" w:lineRule="auto"/>
+        <w:spacing w:after="80" w:before="0" w:line="276" w:lineRule="auto"/>
+        <w:jc w:val="both"/>
       </w:pPr>
       <w:r>
         <w:rPr>
-          <w:rFonts w:ascii="Times New Roman" w:hAnsi="Times New Roman" w:eastAsia="Times New Roman"/>
+          <w:rFonts w:ascii="Times New Roman" w:hAnsi="Times New Roman" w:eastAsia="Times New Roman" w:cs="Times New Roman"/>
           <w:b/>
           <w:i w:val="0"/>
           <w:sz w:val="24"/>
@@ -1487,7 +1560,7 @@
       </w:r>
       <w:r>
         <w:rPr>
-          <w:rFonts w:ascii="Times New Roman" w:hAnsi="Times New Roman" w:eastAsia="Times New Roman"/>
+          <w:rFonts w:ascii="Times New Roman" w:hAnsi="Times New Roman" w:eastAsia="Times New Roman" w:cs="Times New Roman"/>
           <w:b w:val="0"/>
           <w:i w:val="0"/>
           <w:sz w:val="24"/>
@@ -1497,11 +1570,12 @@
     </w:p>
     <w:p>
       <w:pPr>
-        <w:spacing w:after="240" w:before="0" w:line="276" w:lineRule="auto"/>
+        <w:spacing w:after="80" w:before="0" w:line="276" w:lineRule="auto"/>
+        <w:jc w:val="both"/>
       </w:pPr>
       <w:r>
         <w:rPr>
-          <w:rFonts w:ascii="Times New Roman" w:hAnsi="Times New Roman" w:eastAsia="Times New Roman"/>
+          <w:rFonts w:ascii="Times New Roman" w:hAnsi="Times New Roman" w:eastAsia="Times New Roman" w:cs="Times New Roman"/>
           <w:b/>
           <w:i w:val="0"/>
           <w:sz w:val="24"/>
@@ -1510,7 +1584,7 @@
       </w:r>
       <w:r>
         <w:rPr>
-          <w:rFonts w:ascii="Times New Roman" w:hAnsi="Times New Roman" w:eastAsia="Times New Roman"/>
+          <w:rFonts w:ascii="Times New Roman" w:hAnsi="Times New Roman" w:eastAsia="Times New Roman" w:cs="Times New Roman"/>
           <w:b w:val="0"/>
           <w:i w:val="0"/>
           <w:sz w:val="24"/>
@@ -1520,35 +1594,39 @@
     </w:p>
     <w:p>
       <w:pPr>
-        <w:spacing w:after="120" w:before="320" w:line="264" w:lineRule="auto"/>
+        <w:keepNext/>
+        <w:spacing w:after="160" w:before="360" w:line="276" w:lineRule="auto"/>
+        <w:jc w:val="left"/>
       </w:pPr>
       <w:r>
         <w:rPr>
-          <w:rFonts w:ascii="Times New Roman" w:hAnsi="Times New Roman" w:eastAsia="Times New Roman"/>
+          <w:rFonts w:ascii="Times New Roman" w:hAnsi="Times New Roman" w:eastAsia="Times New Roman" w:cs="Times New Roman"/>
           <w:b/>
           <w:i w:val="0"/>
-          <w:sz w:val="28"/>
+          <w:sz w:val="32"/>
         </w:rPr>
         <w:t>Ekran görüntüleri</w:t>
       </w:r>
     </w:p>
     <w:p>
       <w:pPr>
-        <w:spacing w:after="80" w:before="0" w:line="276" w:lineRule="auto"/>
+        <w:keepNext/>
+        <w:spacing w:after="120" w:before="240" w:line="276" w:lineRule="auto"/>
+        <w:jc w:val="left"/>
       </w:pPr>
       <w:r>
         <w:rPr>
-          <w:rFonts w:ascii="Times New Roman" w:hAnsi="Times New Roman" w:eastAsia="Times New Roman"/>
-          <w:b w:val="0"/>
+          <w:rFonts w:ascii="Times New Roman" w:hAnsi="Times New Roman" w:eastAsia="Times New Roman" w:cs="Times New Roman"/>
+          <w:b/>
           <w:i/>
-          <w:sz w:val="24"/>
+          <w:sz w:val="28"/>
         </w:rPr>
         <w:t>Müşteri ana sayfa (Kahve Durağı):</w:t>
       </w:r>
     </w:p>
     <w:p>
       <w:pPr>
-        <w:spacing w:after="200" w:before="0" w:line="276" w:lineRule="auto"/>
+        <w:spacing w:after="200" w:before="120" w:line="276" w:lineRule="auto"/>
         <w:jc w:val="center"/>
       </w:pPr>
       <w:r>
@@ -1588,21 +1666,23 @@
     </w:p>
     <w:p>
       <w:pPr>
-        <w:spacing w:after="80" w:before="120" w:line="276" w:lineRule="auto"/>
+        <w:keepNext/>
+        <w:spacing w:after="120" w:before="240" w:line="276" w:lineRule="auto"/>
+        <w:jc w:val="left"/>
       </w:pPr>
       <w:r>
         <w:rPr>
-          <w:rFonts w:ascii="Times New Roman" w:hAnsi="Times New Roman" w:eastAsia="Times New Roman"/>
-          <w:b w:val="0"/>
+          <w:rFonts w:ascii="Times New Roman" w:hAnsi="Times New Roman" w:eastAsia="Times New Roman" w:cs="Times New Roman"/>
+          <w:b/>
           <w:i/>
-          <w:sz w:val="24"/>
+          <w:sz w:val="28"/>
         </w:rPr>
         <w:t>Admin günlük özet:</w:t>
       </w:r>
     </w:p>
     <w:p>
       <w:pPr>
-        <w:spacing w:after="120" w:before="0" w:line="276" w:lineRule="auto"/>
+        <w:spacing w:after="200" w:before="120" w:line="276" w:lineRule="auto"/>
         <w:jc w:val="center"/>
       </w:pPr>
       <w:r>
@@ -1642,7 +1722,7 @@
     </w:p>
     <w:sectPr>
       <w:pgSz w:w="12240" w:h="15840"/>
-      <w:pgMar w:top="1304" w:right="1417" w:bottom="1304" w:left="1417" w:header="720" w:footer="720" w:gutter="0"/>
+      <w:pgMar w:top="1417" w:right="1417" w:bottom="1417" w:left="1417" w:header="720" w:footer="720" w:gutter="0"/>
       <w:cols w:space="720"/>
       <w:docGrid w:linePitch="360"/>
     </w:sectPr>
@@ -2015,9 +2095,10 @@
     <w:rsid w:val="00FC693F"/>
     <w:pPr>
       <w:spacing w:line="276" w:lineRule="auto"/>
+      <w:jc w:val="both"/>
     </w:pPr>
     <w:rPr>
-      <w:rFonts w:ascii="Times New Roman" w:hAnsi="Times New Roman" w:eastAsia="Times New Roman"/>
+      <w:rFonts w:ascii="Times New Roman" w:hAnsi="Times New Roman" w:eastAsia="Times New Roman" w:cs="Times New Roman"/>
       <w:sz w:val="24"/>
     </w:rPr>
   </w:style>

</xml_diff>